<commit_message>
Documentation for previously fixed complex issues (and sorted existing documentation all into one folder)
</commit_message>
<xml_diff>
--- a/Assets/Documentation and notes/Fixing enemy AI field of view.docx
+++ b/Assets/Documentation and notes/Fixing enemy AI field of view.docx
@@ -672,6 +672,420 @@
         <w:t>Since it seems to have happened just after altering the look code to add some more functions being executed during it, is there some code that causes some enemy AI look functions to run a massive number of times during Awake()?</w:t>
       </w:r>
     </w:p>
+    <w:p>
+      <w:r>
+        <w:t>Hazard Playground still loads fine though. Bunker Escape also loads fine despite there being a lot of enemies.</w:t>
+      </w:r>
+    </w:p>
+    <w:p>
+      <w:r>
+        <w:t>What if it’s not anything to do with the enemies?</w:t>
+      </w:r>
+    </w:p>
+    <w:p>
+      <w:r>
+        <w:t>Power Plant and Rooftop Descent have more ‘elaborate’ (generous) visuals, with a greater variety of materials and shaders.</w:t>
+      </w:r>
+    </w:p>
+    <w:p/>
+    <w:p>
+      <w:r>
+        <w:t>Could the slow generation time be because of old artifacts? Could it be related to how I deleted a whole heap of old scripts for the previous dodgy AI version?</w:t>
+      </w:r>
+    </w:p>
+    <w:p>
+      <w:r>
+        <w:t>I deleted a big chunk of the Library folder and let it reload.</w:t>
+      </w:r>
+    </w:p>
+    <w:p>
+      <w:r>
+        <w:t>It doesn’t seem to have helped the play mode load time in Power Plant.</w:t>
+      </w:r>
+      <w:r>
+        <w:t xml:space="preserve"> Seems to be roughly the same.</w:t>
+      </w:r>
+    </w:p>
+    <w:p>
+      <w:r>
+        <w:t>I should also try stashing my current changes, then loading it again, to see what happens. If the error goes away, it’s something in the stashed changes. If it doesn’t, it’s something I recently committed.</w:t>
+      </w:r>
+    </w:p>
+    <w:p/>
+    <w:p>
+      <w:r>
+        <w:t>Alright I committed some stuff that’s obviously not related, and the stuff to update to the correct version. I can’t test it yet because turns out there’s a bunch of compiler errors, caused by code that haven’t been pushed. I need to clean up my changelog better.</w:t>
+      </w:r>
+    </w:p>
+    <w:p>
+      <w:r>
+        <w:t>Cleaned up enough to make it compile. Loading times still seem to be awful.</w:t>
+      </w:r>
+    </w:p>
+    <w:p>
+      <w:r>
+        <w:t>Maybe I should check how the AI performs. Maybe it’s still broken? I should have thought of that before cancelling out of play mode.</w:t>
+      </w:r>
+    </w:p>
+    <w:p>
+      <w:r>
+        <w:t>Yes, it does actually work! Albeit super laggy, so my performance improvements were clearly necessary. I’ll need to restore my stashed changes and see what the issue is.</w:t>
+      </w:r>
+    </w:p>
+    <w:p/>
+    <w:p>
+      <w:r>
+        <w:lastRenderedPageBreak/>
+        <w:t>Hang on, what if the slow time to enter play mode is because of a large number of entities in Power Plant, and the code to add them all to the array?</w:t>
+      </w:r>
+    </w:p>
+    <w:p>
+      <w:r>
+        <w:t>Disabled that code, doesn’t seem to be doing much.</w:t>
+      </w:r>
+    </w:p>
+    <w:p/>
+    <w:p>
+      <w:r>
+        <w:t>I added a debug message for the AI target manager, showing when the view status changes. It doesn’t seem to be changing at all. So maybe something’s wrong with either the target manager or the field of view code.</w:t>
+      </w:r>
+    </w:p>
+    <w:p>
+      <w:r>
+        <w:t>Hm, it does run on the enemy in the hazard playground scene.</w:t>
+      </w:r>
+    </w:p>
+    <w:p>
+      <w:r>
+        <w:t xml:space="preserve">I need to add more debug messages in </w:t>
+      </w:r>
+      <w:proofErr w:type="spellStart"/>
+      <w:r>
+        <w:t>AITargetManager</w:t>
+      </w:r>
+      <w:proofErr w:type="spellEnd"/>
+      <w:r>
+        <w:t>, to see what’s going on when they search for the enemy.</w:t>
+      </w:r>
+    </w:p>
+    <w:p>
+      <w:r>
+        <w:t>But first I need to make sure the scene actually loads in a reasonable amount of time.</w:t>
+      </w:r>
+    </w:p>
+    <w:p>
+      <w:r>
+        <w:t>I should try checking out the project in a different branch, well before any of the recent changes, and see how it works.</w:t>
+      </w:r>
+    </w:p>
+    <w:p>
+      <w:r>
+        <w:t>Alright, that’ll be a pain in the arse. I need to do it later, but I should try other things first.</w:t>
+      </w:r>
+    </w:p>
+    <w:p>
+      <w:r>
+        <w:t xml:space="preserve">What if I just completely deleted all the cached data? Everything except for Assets, Packages and </w:t>
+      </w:r>
+      <w:proofErr w:type="spellStart"/>
+      <w:r>
+        <w:t>ProjectSettings</w:t>
+      </w:r>
+      <w:proofErr w:type="spellEnd"/>
+      <w:r>
+        <w:t>?</w:t>
+      </w:r>
+    </w:p>
+    <w:p>
+      <w:r>
+        <w:t xml:space="preserve">Nope, didn’t help. And I’ve broken my repository. I’ll need to </w:t>
+      </w:r>
+      <w:proofErr w:type="spellStart"/>
+      <w:r>
+        <w:t>reclone</w:t>
+      </w:r>
+      <w:proofErr w:type="spellEnd"/>
+      <w:r>
+        <w:t xml:space="preserve"> and drag in the new files, to fix it later.</w:t>
+      </w:r>
+    </w:p>
+    <w:p>
+      <w:r>
+        <w:t>The ‘target found’ message never appears. So it can’t be a problem the ‘check view status of specific target’ code. It must be something wrong with the code searching for new objects.</w:t>
+      </w:r>
+    </w:p>
+    <w:p>
+      <w:r>
+        <w:t>I modified the code to check for targets in the field of view, so it shows the number of objects detected. I also added debug messages for every stage of checking each collider.</w:t>
+      </w:r>
+    </w:p>
+    <w:p/>
+    <w:p>
+      <w:r>
+        <w:t>Oh shit! I think I know the problem!</w:t>
+      </w:r>
+    </w:p>
+    <w:p>
+      <w:r>
+        <w:t>There are so many colliders in the scene that it exceeds the number of results that can be stored in the array. So the player’s collider is probably scanned later for whatever reason, and just doesn’t fit in the array.</w:t>
+      </w:r>
+    </w:p>
+    <w:p>
+      <w:r>
+        <w:t>I quadrupled the array size for the collider results. That should fix it.</w:t>
+      </w:r>
+    </w:p>
+    <w:p>
+      <w:r>
+        <w:t>I also made it so each AI has their own array for results, that way I can keep track of everything each AI detects. It’ll also be useful once I set it up to automatically scan things and use listeners.</w:t>
+      </w:r>
+    </w:p>
+    <w:p>
+      <w:r>
+        <w:t>I think I should also figure out how to reduce the number of colliders in the scene.</w:t>
+      </w:r>
+    </w:p>
+    <w:p>
+      <w:r>
+        <w:t xml:space="preserve">I also need to test that system I was making, where it uses </w:t>
+      </w:r>
+      <w:proofErr w:type="spellStart"/>
+      <w:r>
+        <w:t>OverlapBox</w:t>
+      </w:r>
+      <w:proofErr w:type="spellEnd"/>
+      <w:r>
+        <w:t xml:space="preserve"> instead of </w:t>
+      </w:r>
+      <w:proofErr w:type="spellStart"/>
+      <w:r>
+        <w:t>OverlapSphere</w:t>
+      </w:r>
+      <w:proofErr w:type="spellEnd"/>
+      <w:r>
+        <w:t xml:space="preserve"> to reduce the number of colliders being found and checked.</w:t>
+      </w:r>
+    </w:p>
+    <w:p>
+      <w:r>
+        <w:t>But first, I need to exercise.</w:t>
+      </w:r>
+    </w:p>
+    <w:p/>
+    <w:p/>
+    <w:p>
+      <w:r>
+        <w:t>0</w:t>
+      </w:r>
+      <w:r>
+        <w:t>7</w:t>
+      </w:r>
+      <w:r>
+        <w:t>/03/2026</w:t>
+      </w:r>
+    </w:p>
+    <w:p>
+      <w:r>
+        <w:t xml:space="preserve">Alright I think increasing the array size fixes it? In my extremely small </w:t>
+      </w:r>
+      <w:proofErr w:type="gramStart"/>
+      <w:r>
+        <w:t>testing</w:t>
+      </w:r>
+      <w:proofErr w:type="gramEnd"/>
+      <w:r>
+        <w:t xml:space="preserve"> it seems to help. But it’s still laggy due to all the debug messages, and I need to figure out why it’s taking so long to load.</w:t>
+      </w:r>
+    </w:p>
+    <w:p>
+      <w:r>
+        <w:t xml:space="preserve">I re-enabled the debug messages and noticed some stuff about certain </w:t>
+      </w:r>
+      <w:proofErr w:type="spellStart"/>
+      <w:r>
+        <w:t>navmesh</w:t>
+      </w:r>
+      <w:proofErr w:type="spellEnd"/>
+      <w:r>
+        <w:t xml:space="preserve"> functions not being calculated precisely enough. What if that’s causing the long scene load time, due to the relative complexity of this level’s </w:t>
+      </w:r>
+      <w:proofErr w:type="spellStart"/>
+      <w:r>
+        <w:t>navmesh</w:t>
+      </w:r>
+      <w:proofErr w:type="spellEnd"/>
+      <w:r>
+        <w:t>?</w:t>
+      </w:r>
+    </w:p>
+    <w:p/>
+    <w:p>
+      <w:r>
+        <w:t>Not sure, I’ll load again.</w:t>
+      </w:r>
+    </w:p>
+    <w:p>
+      <w:r>
+        <w:t xml:space="preserve">Alright yeah, the enemy AI aiming absolutely works now. Although I found a new bug where enemies will still try to shoot the player through unbreakable glass walls. I think that’s why that second line of sight check was there in </w:t>
+      </w:r>
+      <w:proofErr w:type="spellStart"/>
+      <w:r>
+        <w:t>AIGunAttack</w:t>
+      </w:r>
+      <w:proofErr w:type="spellEnd"/>
+      <w:r>
+        <w:t>, to account for what the enemy’s current attack will be blocked by.</w:t>
+      </w:r>
+    </w:p>
+    <w:p>
+      <w:r>
+        <w:t>Nope, adding that broke the AI again. Do I need to assign that value to a field like with the ‘can see target’ bool? I don’t get why it even glitches out with that material.</w:t>
+      </w:r>
+    </w:p>
+    <w:p>
+      <w:r>
+        <w:t>Nope, didn’t help. This is bullshit.</w:t>
+      </w:r>
+    </w:p>
+    <w:p/>
+    <w:p>
+      <w:r>
+        <w:t>08/03/2026</w:t>
+      </w:r>
+    </w:p>
+    <w:p>
+      <w:r>
+        <w:t xml:space="preserve">It appears that the </w:t>
+      </w:r>
+      <w:proofErr w:type="gramStart"/>
+      <w:r>
+        <w:t>line of sight</w:t>
+      </w:r>
+      <w:proofErr w:type="gramEnd"/>
+      <w:r>
+        <w:t xml:space="preserve"> check isn’t iterating through all the found colliders properly. It checks the first </w:t>
+      </w:r>
+      <w:proofErr w:type="gramStart"/>
+      <w:r>
+        <w:t>one, but</w:t>
+      </w:r>
+      <w:proofErr w:type="gramEnd"/>
+      <w:r>
+        <w:t xml:space="preserve"> doesn’t proceed.</w:t>
+      </w:r>
+    </w:p>
+    <w:p>
+      <w:r>
+        <w:t>The enemy isn’t recognising its own head as an exception.</w:t>
+      </w:r>
+    </w:p>
+    <w:p>
+      <w:r>
+        <w:t>A-ha! I accidentally put &amp;&amp; instead of || in the ‘</w:t>
+      </w:r>
+      <w:proofErr w:type="spellStart"/>
+      <w:r>
+        <w:t>isException</w:t>
+      </w:r>
+      <w:proofErr w:type="spellEnd"/>
+      <w:r>
+        <w:t>’ check, so the AI would only recognise an exception if a collider was part of both itself and the target, which would be impossible.</w:t>
+      </w:r>
+    </w:p>
+    <w:p>
+      <w:r>
+        <w:t>That seems to have fixed it! Although I’ve noticed the enemy sometimes likes to run a weirdly far distance away from the player. I need to look at the engagement distances.</w:t>
+      </w:r>
+    </w:p>
+    <w:p>
+      <w:r>
+        <w:t xml:space="preserve">I made a new </w:t>
+      </w:r>
+      <w:proofErr w:type="spellStart"/>
+      <w:r>
+        <w:t>LineOfSight</w:t>
+      </w:r>
+      <w:proofErr w:type="spellEnd"/>
+      <w:r>
+        <w:t xml:space="preserve"> derivative to fix the incorrect exception check, where I put in two entities and it automatically sets up the desired check. This will eliminate a lot of boilerplate code, reducing the likelihood of such a glitch happening again.</w:t>
+      </w:r>
+    </w:p>
+    <w:p>
+      <w:r>
+        <w:t xml:space="preserve">At some point I need to condense </w:t>
+      </w:r>
+      <w:proofErr w:type="spellStart"/>
+      <w:r>
+        <w:t>RaycastWithExceptions</w:t>
+      </w:r>
+      <w:proofErr w:type="spellEnd"/>
+      <w:r>
+        <w:t xml:space="preserve">, </w:t>
+      </w:r>
+      <w:proofErr w:type="spellStart"/>
+      <w:r>
+        <w:t>LineOfSight</w:t>
+      </w:r>
+      <w:proofErr w:type="spellEnd"/>
+      <w:r>
+        <w:t xml:space="preserve"> and </w:t>
+      </w:r>
+      <w:proofErr w:type="spellStart"/>
+      <w:r>
+        <w:t>LineOfSightToTarget</w:t>
+      </w:r>
+      <w:proofErr w:type="spellEnd"/>
+      <w:r>
+        <w:t xml:space="preserve"> to use the same base code. There’s a lot of </w:t>
+      </w:r>
+      <w:proofErr w:type="gramStart"/>
+      <w:r>
+        <w:t>boilerplate</w:t>
+      </w:r>
+      <w:proofErr w:type="gramEnd"/>
+      <w:r>
+        <w:t xml:space="preserve"> there and it may make things confusing. </w:t>
+      </w:r>
+      <w:proofErr w:type="spellStart"/>
+      <w:r>
+        <w:t>LineOfSight</w:t>
+      </w:r>
+      <w:proofErr w:type="spellEnd"/>
+      <w:r>
+        <w:t xml:space="preserve"> is essentially just an inverse of </w:t>
+      </w:r>
+      <w:proofErr w:type="spellStart"/>
+      <w:r>
+        <w:t>RaycastWithExceptions</w:t>
+      </w:r>
+      <w:proofErr w:type="spellEnd"/>
+      <w:r>
+        <w:t xml:space="preserve">, and </w:t>
+      </w:r>
+      <w:proofErr w:type="spellStart"/>
+      <w:r>
+        <w:t>LineOfSightToTarget</w:t>
+      </w:r>
+      <w:proofErr w:type="spellEnd"/>
+      <w:r>
+        <w:t xml:space="preserve"> is basically </w:t>
+      </w:r>
+      <w:proofErr w:type="spellStart"/>
+      <w:r>
+        <w:t>LineOfSight</w:t>
+      </w:r>
+      <w:proofErr w:type="spellEnd"/>
+      <w:r>
+        <w:t xml:space="preserve"> plus an extra check if the first collider that isn’t part of the AI is part of the target being checked for.</w:t>
+      </w:r>
+    </w:p>
+    <w:p>
+      <w:r>
+        <w:t>Did that.</w:t>
+      </w:r>
+    </w:p>
+    <w:p/>
+    <w:p/>
     <w:sectPr>
       <w:pgSz w:w="11906" w:h="16838"/>
       <w:pgMar w:top="1440" w:right="1440" w:bottom="1440" w:left="1440" w:header="708" w:footer="708" w:gutter="0"/>

</xml_diff>